<commit_message>
Implemented Oct 8 2026 feedback
</commit_message>
<xml_diff>
--- a/docassemble/SmallEstateAffidavit/data/templates/small_estate_affidavit.docx
+++ b/docassemble/SmallEstateAffidavit/data/templates/small_estate_affidavit.docx
@@ -1790,7 +1790,7 @@
     <w:p>
       <w:pPr>
         <w:keepNext/>
-        <w:spacing w:line="240" w:lineRule="auto"/>
+        <w:spacing w:after="0" w:line="240" w:lineRule="auto"/>
         <w:rPr>
           <w:rFonts w:ascii="Verdana" w:hAnsi="Verdana" w:cs="Arial"/>
         </w:rPr>
@@ -2164,7 +2164,7 @@
           <w:rFonts w:ascii="Verdana" w:hAnsi="Verdana" w:cs="Arial"/>
           <w:b/>
         </w:rPr>
-        <w:t xml:space="preserve">% endif </w:t>
+        <w:t xml:space="preserve">% </w:t>
       </w:r>
       <w:proofErr w:type="gramStart"/>
       <w:r>
@@ -2172,22 +2172,25 @@
           <w:rFonts w:ascii="Verdana" w:hAnsi="Verdana" w:cs="Arial"/>
           <w:b/>
         </w:rPr>
-        <w:t>%}</w:t>
-      </w:r>
-      <w:r>
+        <w:t>endif %}</w:t>
+      </w:r>
+      <w:proofErr w:type="gramEnd"/>
+    </w:p>
+    <w:p>
+      <w:pPr>
+        <w:keepNext/>
+        <w:spacing w:line="240" w:lineRule="auto"/>
         <w:rPr>
           <w:rFonts w:ascii="Verdana" w:hAnsi="Verdana" w:cs="Arial"/>
           <w:b/>
         </w:rPr>
-        <w:t>Class</w:t>
-      </w:r>
-      <w:proofErr w:type="gramEnd"/>
+      </w:pPr>
       <w:r>
         <w:rPr>
           <w:rFonts w:ascii="Verdana" w:hAnsi="Verdana" w:cs="Arial"/>
           <w:b/>
         </w:rPr>
-        <w:t xml:space="preserve"> 2 – Surviving </w:t>
+        <w:t xml:space="preserve">Class 2 – Surviving </w:t>
       </w:r>
       <w:proofErr w:type="spellStart"/>
       <w:r>
@@ -2280,7 +2283,7 @@
     <w:p>
       <w:pPr>
         <w:keepNext/>
-        <w:spacing w:line="240" w:lineRule="auto"/>
+        <w:spacing w:after="0" w:line="240" w:lineRule="auto"/>
         <w:rPr>
           <w:rFonts w:ascii="Verdana" w:hAnsi="Verdana" w:cs="Arial"/>
         </w:rPr>
@@ -2856,7 +2859,7 @@
           <w:rFonts w:ascii="Verdana" w:hAnsi="Verdana" w:cs="Arial"/>
           <w:b/>
         </w:rPr>
-        <w:t xml:space="preserve">% endif </w:t>
+        <w:t xml:space="preserve">% </w:t>
       </w:r>
       <w:proofErr w:type="gramStart"/>
       <w:r>
@@ -2864,83 +2867,86 @@
           <w:rFonts w:ascii="Verdana" w:hAnsi="Verdana" w:cs="Arial"/>
           <w:b/>
         </w:rPr>
-        <w:t>%}</w:t>
-      </w:r>
-      <w:r>
-        <w:rPr>
-          <w:rFonts w:ascii="Verdana" w:hAnsi="Verdana" w:cs="Arial"/>
-          <w:b/>
-        </w:rPr>
-        <w:t>Class</w:t>
+        <w:t>endif %}</w:t>
       </w:r>
       <w:proofErr w:type="gramEnd"/>
-      <w:r>
-        <w:rPr>
-          <w:rFonts w:ascii="Verdana" w:hAnsi="Verdana" w:cs="Arial"/>
-          <w:b/>
-        </w:rPr>
-        <w:t xml:space="preserve"> 3 – Debts Due the United </w:t>
-      </w:r>
-      <w:proofErr w:type="gramStart"/>
-      <w:r>
-        <w:rPr>
-          <w:rFonts w:ascii="Verdana" w:hAnsi="Verdana" w:cs="Arial"/>
-          <w:b/>
-        </w:rPr>
-        <w:t>States</w:t>
-      </w:r>
-      <w:r>
-        <w:rPr>
-          <w:rFonts w:ascii="Verdana" w:hAnsi="Verdana" w:cs="Arial"/>
-        </w:rPr>
-        <w:t>{</w:t>
-      </w:r>
-      <w:proofErr w:type="gramEnd"/>
-      <w:r>
-        <w:rPr>
-          <w:rFonts w:ascii="Verdana" w:hAnsi="Verdana" w:cs="Arial"/>
-        </w:rPr>
-        <w:t>% if</w:t>
-      </w:r>
-      <w:r>
-        <w:rPr>
-          <w:rFonts w:ascii="Verdana" w:hAnsi="Verdana" w:cs="Arial"/>
-        </w:rPr>
-        <w:t xml:space="preserve"> not </w:t>
-      </w:r>
-      <w:proofErr w:type="spellStart"/>
-      <w:r>
-        <w:rPr>
-          <w:rFonts w:ascii="Verdana" w:hAnsi="Verdana" w:cs="Arial"/>
-        </w:rPr>
-        <w:t>us_</w:t>
-      </w:r>
-      <w:proofErr w:type="gramStart"/>
-      <w:r>
-        <w:rPr>
-          <w:rFonts w:ascii="Verdana" w:hAnsi="Verdana" w:cs="Arial"/>
-        </w:rPr>
-        <w:t>debts.there</w:t>
-      </w:r>
-      <w:proofErr w:type="gramEnd"/>
-      <w:r>
-        <w:rPr>
-          <w:rFonts w:ascii="Verdana" w:hAnsi="Verdana" w:cs="Arial"/>
-        </w:rPr>
-        <w:t>_are_any</w:t>
-      </w:r>
-      <w:proofErr w:type="spellEnd"/>
-      <w:r>
-        <w:rPr>
-          <w:rFonts w:ascii="Verdana" w:hAnsi="Verdana" w:cs="Arial"/>
-        </w:rPr>
-        <w:t xml:space="preserve"> %}</w:t>
-      </w:r>
     </w:p>
     <w:p>
       <w:pPr>
         <w:keepNext/>
         <w:spacing w:line="240" w:lineRule="auto"/>
+        <w:rPr>
+          <w:rFonts w:ascii="Verdana" w:hAnsi="Verdana" w:cs="Arial"/>
+          <w:b/>
+        </w:rPr>
+      </w:pPr>
+      <w:r>
+        <w:rPr>
+          <w:rFonts w:ascii="Verdana" w:hAnsi="Verdana" w:cs="Arial"/>
+          <w:b/>
+        </w:rPr>
+        <w:t xml:space="preserve">Class 3 – Debts Due the United </w:t>
+      </w:r>
+      <w:proofErr w:type="gramStart"/>
+      <w:r>
+        <w:rPr>
+          <w:rFonts w:ascii="Verdana" w:hAnsi="Verdana" w:cs="Arial"/>
+          <w:b/>
+        </w:rPr>
+        <w:t>States</w:t>
+      </w:r>
+      <w:r>
+        <w:rPr>
+          <w:rFonts w:ascii="Verdana" w:hAnsi="Verdana" w:cs="Arial"/>
+        </w:rPr>
+        <w:t>{</w:t>
+      </w:r>
+      <w:proofErr w:type="gramEnd"/>
+      <w:r>
+        <w:rPr>
+          <w:rFonts w:ascii="Verdana" w:hAnsi="Verdana" w:cs="Arial"/>
+        </w:rPr>
+        <w:t>% if</w:t>
+      </w:r>
+      <w:r>
+        <w:rPr>
+          <w:rFonts w:ascii="Verdana" w:hAnsi="Verdana" w:cs="Arial"/>
+        </w:rPr>
+        <w:t xml:space="preserve"> not </w:t>
+      </w:r>
+      <w:proofErr w:type="spellStart"/>
+      <w:r>
+        <w:rPr>
+          <w:rFonts w:ascii="Verdana" w:hAnsi="Verdana" w:cs="Arial"/>
+        </w:rPr>
+        <w:t>us_</w:t>
+      </w:r>
+      <w:proofErr w:type="gramStart"/>
+      <w:r>
+        <w:rPr>
+          <w:rFonts w:ascii="Verdana" w:hAnsi="Verdana" w:cs="Arial"/>
+        </w:rPr>
+        <w:t>debts.there</w:t>
+      </w:r>
+      <w:proofErr w:type="gramEnd"/>
+      <w:r>
+        <w:rPr>
+          <w:rFonts w:ascii="Verdana" w:hAnsi="Verdana" w:cs="Arial"/>
+        </w:rPr>
+        <w:t>_are_any</w:t>
+      </w:r>
+      <w:proofErr w:type="spellEnd"/>
+      <w:r>
+        <w:rPr>
+          <w:rFonts w:ascii="Verdana" w:hAnsi="Verdana" w:cs="Arial"/>
+        </w:rPr>
+        <w:t xml:space="preserve"> %}</w:t>
+      </w:r>
+    </w:p>
+    <w:p>
+      <w:pPr>
+        <w:keepNext/>
+        <w:spacing w:after="0" w:line="240" w:lineRule="auto"/>
         <w:rPr>
           <w:rFonts w:ascii="Verdana" w:hAnsi="Verdana" w:cs="Arial"/>
         </w:rPr>
@@ -3322,7 +3328,7 @@
           <w:rFonts w:ascii="Verdana" w:hAnsi="Verdana" w:cs="Arial"/>
           <w:b/>
         </w:rPr>
-        <w:t xml:space="preserve">% endif </w:t>
+        <w:t xml:space="preserve">% </w:t>
       </w:r>
       <w:proofErr w:type="gramStart"/>
       <w:r>
@@ -3330,77 +3336,80 @@
           <w:rFonts w:ascii="Verdana" w:hAnsi="Verdana" w:cs="Arial"/>
           <w:b/>
         </w:rPr>
-        <w:t>%}</w:t>
-      </w:r>
-      <w:r>
-        <w:rPr>
-          <w:rFonts w:ascii="Verdana" w:hAnsi="Verdana" w:cs="Arial"/>
-          <w:b/>
-        </w:rPr>
-        <w:t>Class</w:t>
+        <w:t>endif %}</w:t>
       </w:r>
       <w:proofErr w:type="gramEnd"/>
-      <w:r>
-        <w:rPr>
-          <w:rFonts w:ascii="Verdana" w:hAnsi="Verdana" w:cs="Arial"/>
-          <w:b/>
-        </w:rPr>
-        <w:t xml:space="preserve"> 4 – Money Due </w:t>
-      </w:r>
-      <w:proofErr w:type="gramStart"/>
-      <w:r>
-        <w:rPr>
-          <w:rFonts w:ascii="Verdana" w:hAnsi="Verdana" w:cs="Arial"/>
-          <w:b/>
-        </w:rPr>
-        <w:t>Employees</w:t>
-      </w:r>
-      <w:r>
-        <w:rPr>
-          <w:rFonts w:ascii="Verdana" w:hAnsi="Verdana" w:cs="Arial"/>
-        </w:rPr>
-        <w:t>{</w:t>
-      </w:r>
-      <w:proofErr w:type="gramEnd"/>
-      <w:r>
-        <w:rPr>
-          <w:rFonts w:ascii="Verdana" w:hAnsi="Verdana" w:cs="Arial"/>
-        </w:rPr>
-        <w:t xml:space="preserve">% if not </w:t>
-      </w:r>
-      <w:proofErr w:type="spellStart"/>
-      <w:r>
-        <w:rPr>
-          <w:rFonts w:ascii="Verdana" w:hAnsi="Verdana" w:cs="Arial"/>
-        </w:rPr>
-        <w:t>employee_</w:t>
-      </w:r>
-      <w:proofErr w:type="gramStart"/>
-      <w:r>
-        <w:rPr>
-          <w:rFonts w:ascii="Verdana" w:hAnsi="Verdana" w:cs="Arial"/>
-        </w:rPr>
-        <w:t>debts.there</w:t>
-      </w:r>
-      <w:proofErr w:type="gramEnd"/>
-      <w:r>
-        <w:rPr>
-          <w:rFonts w:ascii="Verdana" w:hAnsi="Verdana" w:cs="Arial"/>
-        </w:rPr>
-        <w:t>_are_any</w:t>
-      </w:r>
-      <w:proofErr w:type="spellEnd"/>
-      <w:r>
-        <w:rPr>
-          <w:rFonts w:ascii="Verdana" w:hAnsi="Verdana" w:cs="Arial"/>
-        </w:rPr>
-        <w:t xml:space="preserve"> %}</w:t>
-      </w:r>
     </w:p>
     <w:p>
       <w:pPr>
         <w:keepNext/>
         <w:spacing w:line="240" w:lineRule="auto"/>
+        <w:rPr>
+          <w:rFonts w:ascii="Verdana" w:hAnsi="Verdana" w:cs="Arial"/>
+          <w:b/>
+        </w:rPr>
+      </w:pPr>
+      <w:r>
+        <w:rPr>
+          <w:rFonts w:ascii="Verdana" w:hAnsi="Verdana" w:cs="Arial"/>
+          <w:b/>
+        </w:rPr>
+        <w:t xml:space="preserve">Class 4 – Money Due </w:t>
+      </w:r>
+      <w:proofErr w:type="gramStart"/>
+      <w:r>
+        <w:rPr>
+          <w:rFonts w:ascii="Verdana" w:hAnsi="Verdana" w:cs="Arial"/>
+          <w:b/>
+        </w:rPr>
+        <w:t>Employees</w:t>
+      </w:r>
+      <w:r>
+        <w:rPr>
+          <w:rFonts w:ascii="Verdana" w:hAnsi="Verdana" w:cs="Arial"/>
+        </w:rPr>
+        <w:t>{</w:t>
+      </w:r>
+      <w:proofErr w:type="gramEnd"/>
+      <w:r>
+        <w:rPr>
+          <w:rFonts w:ascii="Verdana" w:hAnsi="Verdana" w:cs="Arial"/>
+        </w:rPr>
+        <w:t xml:space="preserve">% if not </w:t>
+      </w:r>
+      <w:proofErr w:type="spellStart"/>
+      <w:r>
+        <w:rPr>
+          <w:rFonts w:ascii="Verdana" w:hAnsi="Verdana" w:cs="Arial"/>
+        </w:rPr>
+        <w:t>employee_</w:t>
+      </w:r>
+      <w:proofErr w:type="gramStart"/>
+      <w:r>
+        <w:rPr>
+          <w:rFonts w:ascii="Verdana" w:hAnsi="Verdana" w:cs="Arial"/>
+        </w:rPr>
+        <w:t>debts.there</w:t>
+      </w:r>
+      <w:proofErr w:type="gramEnd"/>
+      <w:r>
+        <w:rPr>
+          <w:rFonts w:ascii="Verdana" w:hAnsi="Verdana" w:cs="Arial"/>
+        </w:rPr>
+        <w:t>_are_any</w:t>
+      </w:r>
+      <w:proofErr w:type="spellEnd"/>
+      <w:r>
+        <w:rPr>
+          <w:rFonts w:ascii="Verdana" w:hAnsi="Verdana" w:cs="Arial"/>
+        </w:rPr>
+        <w:t xml:space="preserve"> %}</w:t>
+      </w:r>
+    </w:p>
+    <w:p>
+      <w:pPr>
+        <w:keepNext/>
+        <w:spacing w:after="0" w:line="240" w:lineRule="auto"/>
         <w:rPr>
           <w:rFonts w:ascii="Verdana" w:hAnsi="Verdana" w:cs="Arial"/>
         </w:rPr>
@@ -3800,7 +3809,7 @@
           <w:rFonts w:ascii="Verdana" w:hAnsi="Verdana" w:cs="Arial"/>
           <w:b/>
         </w:rPr>
-        <w:t xml:space="preserve">% endif </w:t>
+        <w:t xml:space="preserve">% </w:t>
       </w:r>
       <w:proofErr w:type="gramStart"/>
       <w:r>
@@ -3808,22 +3817,26 @@
           <w:rFonts w:ascii="Verdana" w:hAnsi="Verdana" w:cs="Arial"/>
           <w:b/>
         </w:rPr>
-        <w:t>%}</w:t>
-      </w:r>
-      <w:r>
+        <w:t>endif %}</w:t>
+      </w:r>
+      <w:proofErr w:type="gramEnd"/>
+    </w:p>
+    <w:p>
+      <w:pPr>
+        <w:keepNext/>
+        <w:keepLines/>
+        <w:spacing w:line="240" w:lineRule="auto"/>
         <w:rPr>
           <w:rFonts w:ascii="Verdana" w:hAnsi="Verdana" w:cs="Arial"/>
           <w:b/>
         </w:rPr>
-        <w:t>Class</w:t>
-      </w:r>
-      <w:proofErr w:type="gramEnd"/>
+      </w:pPr>
       <w:r>
         <w:rPr>
           <w:rFonts w:ascii="Verdana" w:hAnsi="Verdana" w:cs="Arial"/>
           <w:b/>
         </w:rPr>
-        <w:t xml:space="preserve"> 5 – Money or Property Held in </w:t>
+        <w:t xml:space="preserve">Class 5 – Money or Property Held in </w:t>
       </w:r>
       <w:proofErr w:type="gramStart"/>
       <w:r>
@@ -4139,7 +4152,7 @@
     </w:p>
     <w:p>
       <w:pPr>
-        <w:spacing w:line="240" w:lineRule="auto"/>
+        <w:spacing w:after="0" w:line="240" w:lineRule="auto"/>
         <w:rPr>
           <w:rFonts w:ascii="Verdana" w:hAnsi="Verdana" w:cs="Arial"/>
         </w:rPr>
@@ -4166,30 +4179,25 @@
           <w:rFonts w:ascii="Verdana" w:hAnsi="Verdana" w:cs="Arial"/>
           <w:b/>
         </w:rPr>
-        <w:t xml:space="preserve">{% endif </w:t>
-      </w:r>
-      <w:proofErr w:type="gramStart"/>
-      <w:r>
+        <w:t>{% endif %}</w:t>
+      </w:r>
+    </w:p>
+    <w:p>
+      <w:pPr>
+        <w:keepNext/>
+        <w:keepLines/>
+        <w:spacing w:line="240" w:lineRule="auto"/>
         <w:rPr>
           <w:rFonts w:ascii="Verdana" w:hAnsi="Verdana" w:cs="Arial"/>
           <w:b/>
         </w:rPr>
-        <w:t>%}</w:t>
-      </w:r>
+      </w:pPr>
       <w:r>
         <w:rPr>
           <w:rFonts w:ascii="Verdana" w:hAnsi="Verdana" w:cs="Arial"/>
           <w:b/>
         </w:rPr>
-        <w:t>Class</w:t>
-      </w:r>
-      <w:proofErr w:type="gramEnd"/>
-      <w:r>
-        <w:rPr>
-          <w:rFonts w:ascii="Verdana" w:hAnsi="Verdana" w:cs="Arial"/>
-          <w:b/>
-        </w:rPr>
-        <w:t xml:space="preserve"> 6 – Debts Due State of Illinois and </w:t>
+        <w:t xml:space="preserve">Class 6 – Debts Due State of Illinois and </w:t>
       </w:r>
       <w:proofErr w:type="gramStart"/>
       <w:r>
@@ -4600,7 +4608,7 @@
     </w:p>
     <w:p>
       <w:pPr>
-        <w:spacing w:line="240" w:lineRule="auto"/>
+        <w:spacing w:after="0" w:line="240" w:lineRule="auto"/>
         <w:rPr>
           <w:rFonts w:ascii="Verdana" w:hAnsi="Verdana" w:cs="Arial"/>
         </w:rPr>
@@ -4627,30 +4635,26 @@
           <w:rFonts w:ascii="Verdana" w:hAnsi="Verdana" w:cs="Arial"/>
           <w:b/>
         </w:rPr>
-        <w:t xml:space="preserve">{% endif </w:t>
-      </w:r>
-      <w:proofErr w:type="gramStart"/>
-      <w:r>
+        <w:lastRenderedPageBreak/>
+        <w:t>{% endif %}</w:t>
+      </w:r>
+    </w:p>
+    <w:p>
+      <w:pPr>
+        <w:keepNext/>
+        <w:keepLines/>
+        <w:spacing w:line="240" w:lineRule="auto"/>
         <w:rPr>
           <w:rFonts w:ascii="Verdana" w:hAnsi="Verdana" w:cs="Arial"/>
           <w:b/>
         </w:rPr>
-        <w:t>%}</w:t>
-      </w:r>
+      </w:pPr>
       <w:r>
         <w:rPr>
           <w:rFonts w:ascii="Verdana" w:hAnsi="Verdana" w:cs="Arial"/>
           <w:b/>
         </w:rPr>
-        <w:t>Class</w:t>
-      </w:r>
-      <w:proofErr w:type="gramEnd"/>
-      <w:r>
-        <w:rPr>
-          <w:rFonts w:ascii="Verdana" w:hAnsi="Verdana" w:cs="Arial"/>
-          <w:b/>
-        </w:rPr>
-        <w:t xml:space="preserve"> 7 – All Other </w:t>
+        <w:t xml:space="preserve">Class 7 – All Other </w:t>
       </w:r>
       <w:proofErr w:type="gramStart"/>
       <w:r>
@@ -5187,7 +5191,6 @@
         <w:rPr>
           <w:rFonts w:ascii="Verdana" w:hAnsi="Verdana" w:cs="Arial"/>
         </w:rPr>
-        <w:lastRenderedPageBreak/>
         <w:t xml:space="preserve">{% </w:t>
       </w:r>
       <w:proofErr w:type="spellStart"/>
@@ -5229,7 +5232,7 @@
     </w:p>
     <w:p>
       <w:pPr>
-        <w:spacing w:line="240" w:lineRule="auto"/>
+        <w:spacing w:after="0" w:line="240" w:lineRule="auto"/>
         <w:rPr>
           <w:rFonts w:ascii="Verdana" w:hAnsi="Verdana" w:cs="Arial"/>
         </w:rPr>
@@ -5477,6 +5480,7 @@
                 <w:rFonts w:ascii="Verdana" w:hAnsi="Verdana" w:cs="Arial"/>
                 <w:b/>
               </w:rPr>
+              <w:lastRenderedPageBreak/>
               <w:t>Name and Relationship</w:t>
             </w:r>
           </w:p>
@@ -5912,7 +5916,6 @@
         <w:rPr>
           <w:rFonts w:ascii="Verdana" w:hAnsi="Verdana" w:cs="Arial"/>
         </w:rPr>
-        <w:lastRenderedPageBreak/>
         <w:t xml:space="preserve">(b) The award allowable to the surviving spouse of a decedent who was an Illinois resident </w:t>
       </w:r>
       <w:proofErr w:type="gramStart"/>
@@ -6221,6 +6224,7 @@
         <w:rPr>
           <w:rFonts w:ascii="Verdana" w:hAnsi="Verdana" w:cs="Arial"/>
         </w:rPr>
+        <w:lastRenderedPageBreak/>
         <w:t xml:space="preserve">(c) If there is no surviving spouse, the award allowable to the minor children and adult dependent children of a decedent who was an Illinois resident is: </w:t>
       </w:r>
       <w:r>
@@ -6354,14 +6358,7 @@
         <w:rPr>
           <w:rFonts w:ascii="Verdana" w:hAnsi="Verdana" w:cs="Arial"/>
         </w:rPr>
-        <w:t xml:space="preserve">The decedent left no will. The names, places of residence and relationships of the decedent's heirs, and the portion of the estate to which </w:t>
-      </w:r>
-      <w:r>
-        <w:rPr>
-          <w:rFonts w:ascii="Verdana" w:hAnsi="Verdana" w:cs="Arial"/>
-        </w:rPr>
-        <w:lastRenderedPageBreak/>
-        <w:t xml:space="preserve">each heir is entitled under the law where decedent died intestate are as </w:t>
+        <w:t xml:space="preserve">The decedent left no will. The names, places of residence and relationships of the decedent's heirs, and the portion of the estate to which each heir is entitled under the law where decedent died intestate are as </w:t>
       </w:r>
       <w:proofErr w:type="gramStart"/>
       <w:r>
@@ -6430,6 +6427,7 @@
                 <w:rFonts w:ascii="Verdana" w:hAnsi="Verdana" w:cs="Arial"/>
                 <w:b/>
               </w:rPr>
+              <w:lastRenderedPageBreak/>
               <w:t>Name and Relationship</w:t>
             </w:r>
           </w:p>
@@ -7020,7 +7018,7 @@
           <w:rFonts w:ascii="Verdana" w:hAnsi="Verdana" w:cs="Arial"/>
           <w:b/>
         </w:rPr>
-        <w:t xml:space="preserve">10.5 I understand that the decedent's estate must be distributed first to satisfy claims against the decedent's estate as set forth in paragraph 7.5 of this affidavit before any distribution is made to any heir or legatee. By signing this affidavit, I agree to indemnify and hold harmless all creditors of the decedent's estate, the decedent's </w:t>
+        <w:t xml:space="preserve">10.5 I understand that the decedent's estate must be distributed first to satisfy claims against the decedent's estate as set forth in paragraph 7.5 of this affidavit before any distribution is made to any heir or legatee. By signing this affidavit, I agree to indemnify and hold harmless all creditors of the decedent's estate, the decedent's heirs and legatees, and other persons, corporations, or financial institutions relying upon this affidavit who incur any loss because of reliance on this affidavit, up to the amount lost because of any act or </w:t>
       </w:r>
       <w:r>
         <w:rPr>
@@ -7028,7 +7026,7 @@
           <w:b/>
         </w:rPr>
         <w:lastRenderedPageBreak/>
-        <w:t xml:space="preserve">heirs and legatees, and other persons, corporations, or financial institutions relying upon this affidavit who incur any loss because of reliance on this affidavit, up to the amount lost because of any act or omission by me. I further understand that any person, corporation, or financial institution recovering under this indemnification provision shall be entitled to reasonable attorney's fees and the expenses of recovery. </w:t>
+        <w:t xml:space="preserve">omission by me. I further understand that any person, corporation, or financial institution recovering under this indemnification provision shall be entitled to reasonable attorney's fees and the expenses of recovery. </w:t>
       </w:r>
     </w:p>
     <w:p>
@@ -7353,6 +7351,13 @@
               </w:rPr>
               <w:t>$</w:t>
             </w:r>
+            <w:r>
+              <w:rPr>
+                <w:rFonts w:ascii="Verdana" w:hAnsi="Verdana" w:cs="Arial"/>
+                <w:u w:val="single"/>
+              </w:rPr>
+              <w:t>_________</w:t>
+            </w:r>
           </w:p>
         </w:tc>
       </w:tr>
@@ -7953,7 +7958,7 @@
       </w:r>
     </w:p>
     <w:sectPr>
-      <w:footerReference w:type="default" r:id="rId7"/>
+      <w:footerReference w:type="default" r:id="rId8"/>
       <w:pgSz w:w="12240" w:h="15840"/>
       <w:pgMar w:top="1440" w:right="1440" w:bottom="1440" w:left="1440" w:header="720" w:footer="720" w:gutter="0"/>
       <w:cols w:space="720"/>
@@ -8002,11 +8007,18 @@
       <w:p>
         <w:pPr>
           <w:pStyle w:val="Footer"/>
+          <w:pBdr>
+            <w:top w:val="single" w:sz="4" w:space="1" w:color="auto"/>
+          </w:pBdr>
+          <w:ind w:left="-864" w:right="-864"/>
           <w:rPr>
             <w:sz w:val="2"/>
             <w:szCs w:val="2"/>
           </w:rPr>
         </w:pPr>
+        <w:r>
+          <w:t xml:space="preserve"> </w:t>
+        </w:r>
       </w:p>
       <w:tbl>
         <w:tblPr>
@@ -8062,15 +8074,7 @@
                   <w:sz w:val="18"/>
                   <w:szCs w:val="18"/>
                 </w:rPr>
-                <w:t xml:space="preserve">Estates &amp; Powers of Attorney | </w:t>
-              </w:r>
-              <w:r>
-                <w:rPr>
-                  <w:rFonts w:ascii="Verdana" w:hAnsi="Verdana"/>
-                  <w:sz w:val="18"/>
-                  <w:szCs w:val="18"/>
-                </w:rPr>
-                <w:t>Divorce | © Illinois Legal Aid Online</w:t>
+                <w:t>Estates &amp; Powers of Attorney | © Illinois Legal Aid Online</w:t>
               </w:r>
             </w:p>
           </w:tc>
@@ -10070,4 +10074,16 @@
     </a:ext>
   </a:extLst>
 </a:theme>
+</file>
+
+<file path=customXml/item1.xml><?xml version="1.0" encoding="utf-8"?>
+<b:Sources xmlns:b="http://schemas.openxmlformats.org/officeDocument/2006/bibliography" xmlns="http://schemas.openxmlformats.org/officeDocument/2006/bibliography" SelectedStyle="\APASixthEditionOfficeOnline.xsl" StyleName="APA" Version="6"/>
+</file>
+
+<file path=customXml/itemProps1.xml><?xml version="1.0" encoding="utf-8"?>
+<ds:datastoreItem xmlns:ds="http://schemas.openxmlformats.org/officeDocument/2006/customXml" ds:itemID="{3DFD3037-A61B-416F-A4F9-7040E900F63A}">
+  <ds:schemaRefs>
+    <ds:schemaRef ds:uri="http://schemas.openxmlformats.org/officeDocument/2006/bibliography"/>
+  </ds:schemaRefs>
+</ds:datastoreItem>
 </file>
</xml_diff>

<commit_message>
Implemented Oct 14 2026 feedback
</commit_message>
<xml_diff>
--- a/docassemble/SmallEstateAffidavit/data/templates/small_estate_affidavit.docx
+++ b/docassemble/SmallEstateAffidavit/data/templates/small_estate_affidavit.docx
@@ -7601,6 +7601,8 @@
           </w:tcPr>
           <w:p>
             <w:pPr>
+              <w:keepNext/>
+              <w:keepLines/>
               <w:rPr>
                 <w:rFonts w:ascii="Verdana" w:hAnsi="Verdana" w:cs="Arial"/>
               </w:rPr>
@@ -7613,6 +7615,8 @@
           </w:tcPr>
           <w:p>
             <w:pPr>
+              <w:keepNext/>
+              <w:keepLines/>
               <w:spacing w:after="20"/>
               <w:rPr>
                 <w:rFonts w:ascii="Verdana" w:hAnsi="Verdana" w:cs="Arial"/>
@@ -7634,6 +7638,8 @@
           </w:tcPr>
           <w:p>
             <w:pPr>
+              <w:keepNext/>
+              <w:keepLines/>
               <w:rPr>
                 <w:rFonts w:ascii="Verdana" w:hAnsi="Verdana" w:cs="Arial"/>
               </w:rPr>
@@ -7646,6 +7652,8 @@
           </w:tcPr>
           <w:p>
             <w:pPr>
+              <w:keepNext/>
+              <w:keepLines/>
               <w:rPr>
                 <w:rFonts w:ascii="Verdana" w:hAnsi="Verdana" w:cs="Arial"/>
               </w:rPr>
@@ -7674,6 +7682,8 @@
           </w:tcPr>
           <w:p>
             <w:pPr>
+              <w:keepNext/>
+              <w:keepLines/>
               <w:spacing w:after="160" w:line="278" w:lineRule="auto"/>
               <w:rPr>
                 <w:rFonts w:ascii="Verdana" w:hAnsi="Verdana" w:cs="Arial"/>
@@ -7695,6 +7705,8 @@
           </w:tcPr>
           <w:p>
             <w:pPr>
+              <w:keepNext/>
+              <w:keepLines/>
               <w:spacing w:after="160" w:line="278" w:lineRule="auto"/>
               <w:rPr>
                 <w:rFonts w:ascii="Verdana" w:hAnsi="Verdana" w:cs="Arial"/>
@@ -7704,6 +7716,8 @@
           </w:p>
           <w:p>
             <w:pPr>
+              <w:keepNext/>
+              <w:keepLines/>
               <w:spacing w:after="160" w:line="278" w:lineRule="auto"/>
               <w:rPr>
                 <w:rFonts w:ascii="Verdana" w:hAnsi="Verdana" w:cs="Arial"/>
@@ -7764,6 +7778,8 @@
           </w:tcPr>
           <w:p>
             <w:pPr>
+              <w:keepNext/>
+              <w:keepLines/>
               <w:spacing w:after="160" w:line="278" w:lineRule="auto"/>
               <w:rPr>
                 <w:rFonts w:ascii="Verdana" w:hAnsi="Verdana" w:cs="Arial"/>
@@ -7778,6 +7794,8 @@
           </w:tcPr>
           <w:p>
             <w:pPr>
+              <w:keepNext/>
+              <w:keepLines/>
               <w:spacing w:after="160" w:line="278" w:lineRule="auto"/>
               <w:rPr>
                 <w:rFonts w:ascii="Verdana" w:hAnsi="Verdana" w:cs="Arial"/>
@@ -7795,6 +7813,8 @@
     </w:tbl>
     <w:p>
       <w:pPr>
+        <w:keepNext/>
+        <w:keepLines/>
         <w:rPr>
           <w:rFonts w:ascii="Verdana" w:hAnsi="Verdana" w:cs="Arial"/>
           <w:b/>
@@ -7827,6 +7847,8 @@
           </w:tcPr>
           <w:p>
             <w:pPr>
+              <w:keepNext/>
+              <w:keepLines/>
               <w:spacing w:after="160" w:line="278" w:lineRule="auto"/>
               <w:rPr>
                 <w:rFonts w:ascii="Verdana" w:hAnsi="Verdana" w:cs="Arial"/>
@@ -7842,6 +7864,8 @@
           </w:tcPr>
           <w:p>
             <w:pPr>
+              <w:keepNext/>
+              <w:keepLines/>
               <w:spacing w:after="160" w:line="278" w:lineRule="auto"/>
               <w:rPr>
                 <w:rFonts w:ascii="Verdana" w:hAnsi="Verdana" w:cs="Arial"/>
@@ -7902,6 +7926,8 @@
           </w:tcPr>
           <w:p>
             <w:pPr>
+              <w:keepNext/>
+              <w:keepLines/>
               <w:spacing w:after="160" w:line="278" w:lineRule="auto"/>
               <w:rPr>
                 <w:rFonts w:ascii="Verdana" w:hAnsi="Verdana" w:cs="Arial"/>
@@ -7916,6 +7942,8 @@
           </w:tcPr>
           <w:p>
             <w:pPr>
+              <w:keepNext/>
+              <w:keepLines/>
               <w:spacing w:after="160" w:line="278" w:lineRule="auto"/>
               <w:rPr>
                 <w:rFonts w:ascii="Verdana" w:hAnsi="Verdana" w:cs="Arial"/>
@@ -7933,6 +7961,8 @@
     </w:tbl>
     <w:p>
       <w:pPr>
+        <w:keepNext/>
+        <w:keepLines/>
         <w:rPr>
           <w:rFonts w:ascii="Verdana" w:hAnsi="Verdana" w:cs="Arial"/>
           <w:b/>
@@ -7942,6 +7972,8 @@
     </w:p>
     <w:p>
       <w:pPr>
+        <w:keepNext/>
+        <w:keepLines/>
         <w:rPr>
           <w:rFonts w:ascii="Verdana" w:hAnsi="Verdana" w:cs="Arial"/>
           <w:b/>

</xml_diff>

<commit_message>
Implemented Oct 16 2026 feedback
</commit_message>
<xml_diff>
--- a/docassemble/SmallEstateAffidavit/data/templates/small_estate_affidavit.docx
+++ b/docassemble/SmallEstateAffidavit/data/templates/small_estate_affidavit.docx
@@ -7483,8 +7483,6 @@
           </w:tcPr>
           <w:p>
             <w:pPr>
-              <w:keepNext/>
-              <w:spacing w:after="160" w:line="278" w:lineRule="auto"/>
               <w:rPr>
                 <w:rFonts w:ascii="Verdana" w:hAnsi="Verdana" w:cs="Arial"/>
               </w:rPr>
@@ -7493,7 +7491,61 @@
               <w:rPr>
                 <w:rFonts w:ascii="Verdana" w:hAnsi="Verdana" w:cs="Arial"/>
               </w:rPr>
-              <w:t>Signature of Affiant</w:t>
+              <w:t xml:space="preserve">Signature of </w:t>
+            </w:r>
+            <w:proofErr w:type="gramStart"/>
+            <w:r>
+              <w:rPr>
+                <w:rFonts w:ascii="Verdana" w:hAnsi="Verdana" w:cs="Arial"/>
+              </w:rPr>
+              <w:t>Affiant</w:t>
+            </w:r>
+            <w:r>
+              <w:rPr>
+                <w:rFonts w:ascii="Verdana" w:hAnsi="Verdana" w:cs="Arial"/>
+              </w:rPr>
+              <w:t>,</w:t>
+            </w:r>
+            <w:r>
+              <w:rPr>
+                <w:rFonts w:ascii="Verdana" w:hAnsi="Verdana" w:cs="Arial"/>
+              </w:rPr>
+              <w:t xml:space="preserve"> </w:t>
+            </w:r>
+            <w:r>
+              <w:rPr>
+                <w:rFonts w:ascii="Verdana" w:hAnsi="Verdana" w:cs="Arial"/>
+              </w:rPr>
+              <w:t>{{</w:t>
+            </w:r>
+            <w:proofErr w:type="spellStart"/>
+            <w:proofErr w:type="gramEnd"/>
+            <w:r>
+              <w:rPr>
+                <w:rFonts w:ascii="Verdana" w:hAnsi="Verdana" w:cs="Arial"/>
+              </w:rPr>
+              <w:t>return_user_name</w:t>
+            </w:r>
+            <w:proofErr w:type="spellEnd"/>
+            <w:r>
+              <w:rPr>
+                <w:rFonts w:ascii="Verdana" w:hAnsi="Verdana" w:cs="Arial"/>
+              </w:rPr>
+              <w:t>(</w:t>
+            </w:r>
+            <w:proofErr w:type="gramStart"/>
+            <w:r>
+              <w:rPr>
+                <w:rFonts w:ascii="Verdana" w:hAnsi="Verdana" w:cs="Arial"/>
+              </w:rPr>
+              <w:t>users[</w:t>
+            </w:r>
+            <w:proofErr w:type="gramEnd"/>
+            <w:r>
+              <w:rPr>
+                <w:rFonts w:ascii="Verdana" w:hAnsi="Verdana" w:cs="Arial"/>
+              </w:rPr>
+              <w:t>0])}}</w:t>
             </w:r>
           </w:p>
         </w:tc>
@@ -7519,308 +7571,89 @@
           <w:rFonts w:ascii="Verdana" w:hAnsi="Verdana" w:cs="Arial"/>
         </w:rPr>
       </w:pPr>
-      <w:r>
-        <w:rPr>
-          <w:rFonts w:ascii="Verdana" w:hAnsi="Verdana" w:cs="Arial"/>
-        </w:rPr>
-        <w:t>{{</w:t>
-      </w:r>
-      <w:proofErr w:type="spellStart"/>
-      <w:r>
-        <w:rPr>
-          <w:rFonts w:ascii="Verdana" w:hAnsi="Verdana" w:cs="Arial"/>
-        </w:rPr>
-        <w:t>return_user_name</w:t>
-      </w:r>
-      <w:proofErr w:type="spellEnd"/>
-      <w:r>
-        <w:rPr>
-          <w:rFonts w:ascii="Verdana" w:hAnsi="Verdana" w:cs="Arial"/>
-        </w:rPr>
-        <w:t>(</w:t>
-      </w:r>
-      <w:proofErr w:type="gramStart"/>
-      <w:r>
-        <w:rPr>
-          <w:rFonts w:ascii="Verdana" w:hAnsi="Verdana" w:cs="Arial"/>
-        </w:rPr>
-        <w:t>users[</w:t>
-      </w:r>
-      <w:proofErr w:type="gramEnd"/>
-      <w:r>
-        <w:rPr>
-          <w:rFonts w:ascii="Verdana" w:hAnsi="Verdana" w:cs="Arial"/>
-        </w:rPr>
-        <w:t>0</w:t>
-      </w:r>
-      <w:proofErr w:type="gramStart"/>
-      <w:r>
-        <w:rPr>
-          <w:rFonts w:ascii="Verdana" w:hAnsi="Verdana" w:cs="Arial"/>
-        </w:rPr>
-        <w:t>])}}</w:t>
-      </w:r>
-      <w:proofErr w:type="gramEnd"/>
     </w:p>
     <w:p>
       <w:pPr>
-        <w:rPr>
-          <w:rFonts w:ascii="Verdana" w:hAnsi="Verdana" w:cs="Arial"/>
-        </w:rPr>
-      </w:pPr>
-    </w:p>
-    <w:p>
-      <w:pPr>
-        <w:rPr>
-          <w:rFonts w:ascii="Verdana" w:hAnsi="Verdana" w:cs="Arial"/>
-        </w:rPr>
-      </w:pPr>
-    </w:p>
-    <w:tbl>
-      <w:tblPr>
-        <w:tblStyle w:val="TableGrid"/>
-        <w:tblW w:w="0" w:type="auto"/>
-        <w:tblBorders>
-          <w:top w:val="none" w:sz="0" w:space="0" w:color="auto"/>
-          <w:left w:val="none" w:sz="0" w:space="0" w:color="auto"/>
-          <w:bottom w:val="none" w:sz="0" w:space="0" w:color="auto"/>
-          <w:right w:val="none" w:sz="0" w:space="0" w:color="auto"/>
-          <w:insideH w:val="none" w:sz="0" w:space="0" w:color="auto"/>
-          <w:insideV w:val="none" w:sz="0" w:space="0" w:color="auto"/>
-        </w:tblBorders>
-        <w:tblLook w:val="04A0" w:firstRow="1" w:lastRow="0" w:firstColumn="1" w:lastColumn="0" w:noHBand="0" w:noVBand="1"/>
-      </w:tblPr>
-      <w:tblGrid>
-        <w:gridCol w:w="3020"/>
-        <w:gridCol w:w="6340"/>
-      </w:tblGrid>
-      <w:tr>
-        <w:tc>
-          <w:tcPr>
-            <w:tcW w:w="3020" w:type="dxa"/>
-          </w:tcPr>
-          <w:p>
-            <w:pPr>
-              <w:keepNext/>
-              <w:keepLines/>
-              <w:rPr>
-                <w:rFonts w:ascii="Verdana" w:hAnsi="Verdana" w:cs="Arial"/>
-              </w:rPr>
-            </w:pPr>
-          </w:p>
-        </w:tc>
-        <w:tc>
-          <w:tcPr>
-            <w:tcW w:w="6340" w:type="dxa"/>
-          </w:tcPr>
-          <w:p>
-            <w:pPr>
-              <w:keepNext/>
-              <w:keepLines/>
-              <w:spacing w:after="20"/>
-              <w:rPr>
-                <w:rFonts w:ascii="Verdana" w:hAnsi="Verdana" w:cs="Arial"/>
-              </w:rPr>
-            </w:pPr>
-            <w:r>
-              <w:rPr>
-                <w:rFonts w:ascii="Verdana" w:hAnsi="Verdana" w:cs="Arial"/>
-              </w:rPr>
-              <w:t>STATE OF ILLINOIS</w:t>
-            </w:r>
-          </w:p>
-        </w:tc>
-      </w:tr>
-      <w:tr>
-        <w:tc>
-          <w:tcPr>
-            <w:tcW w:w="3020" w:type="dxa"/>
-          </w:tcPr>
-          <w:p>
-            <w:pPr>
-              <w:keepNext/>
-              <w:keepLines/>
-              <w:rPr>
-                <w:rFonts w:ascii="Verdana" w:hAnsi="Verdana" w:cs="Arial"/>
-              </w:rPr>
-            </w:pPr>
-          </w:p>
-        </w:tc>
-        <w:tc>
-          <w:tcPr>
-            <w:tcW w:w="6340" w:type="dxa"/>
-          </w:tcPr>
-          <w:p>
-            <w:pPr>
-              <w:keepNext/>
-              <w:keepLines/>
-              <w:rPr>
-                <w:rFonts w:ascii="Verdana" w:hAnsi="Verdana" w:cs="Arial"/>
-              </w:rPr>
-            </w:pPr>
-            <w:r>
-              <w:rPr>
-                <w:rFonts w:ascii="Verdana" w:hAnsi="Verdana" w:cs="Arial"/>
-              </w:rPr>
-              <w:t xml:space="preserve">COUNTY OF </w:t>
-            </w:r>
-            <w:r>
-              <w:rPr>
-                <w:rFonts w:ascii="Verdana" w:hAnsi="Verdana" w:cs="Arial"/>
-                <w:u w:val="single"/>
-              </w:rPr>
-              <w:t>___________________</w:t>
-            </w:r>
-          </w:p>
-        </w:tc>
-      </w:tr>
-      <w:tr>
-        <w:tc>
-          <w:tcPr>
-            <w:tcW w:w="3020" w:type="dxa"/>
-            <w:hideMark/>
-          </w:tcPr>
-          <w:p>
-            <w:pPr>
-              <w:keepNext/>
-              <w:keepLines/>
-              <w:spacing w:after="160" w:line="278" w:lineRule="auto"/>
-              <w:rPr>
-                <w:rFonts w:ascii="Verdana" w:hAnsi="Verdana" w:cs="Arial"/>
-                <w:u w:val="single"/>
-              </w:rPr>
-            </w:pPr>
-            <w:r>
-              <w:rPr>
-                <w:rFonts w:ascii="Verdana" w:hAnsi="Verdana" w:cs="Arial"/>
-              </w:rPr>
-              <w:t xml:space="preserve">Signed and sworn before me on </w:t>
-            </w:r>
-          </w:p>
-        </w:tc>
-        <w:tc>
-          <w:tcPr>
-            <w:tcW w:w="6340" w:type="dxa"/>
-            <w:hideMark/>
-          </w:tcPr>
-          <w:p>
-            <w:pPr>
-              <w:keepNext/>
-              <w:keepLines/>
-              <w:spacing w:after="160" w:line="278" w:lineRule="auto"/>
-              <w:rPr>
-                <w:rFonts w:ascii="Verdana" w:hAnsi="Verdana" w:cs="Arial"/>
-                <w:u w:val="single"/>
-              </w:rPr>
-            </w:pPr>
-          </w:p>
-          <w:p>
-            <w:pPr>
-              <w:keepNext/>
-              <w:keepLines/>
-              <w:spacing w:after="160" w:line="278" w:lineRule="auto"/>
-              <w:rPr>
-                <w:rFonts w:ascii="Verdana" w:hAnsi="Verdana" w:cs="Arial"/>
-              </w:rPr>
-            </w:pPr>
-            <w:r>
-              <w:rPr>
-                <w:rFonts w:ascii="Verdana" w:hAnsi="Verdana" w:cs="Arial"/>
-                <w:u w:val="single"/>
-              </w:rPr>
-              <w:tab/>
-            </w:r>
-            <w:r>
-              <w:rPr>
-                <w:rFonts w:ascii="Verdana" w:hAnsi="Verdana" w:cs="Arial"/>
-                <w:u w:val="single"/>
-              </w:rPr>
-              <w:tab/>
-            </w:r>
-            <w:r>
-              <w:rPr>
-                <w:rFonts w:ascii="Verdana" w:hAnsi="Verdana" w:cs="Arial"/>
-                <w:u w:val="single"/>
-              </w:rPr>
-              <w:tab/>
-            </w:r>
-            <w:r>
-              <w:rPr>
-                <w:rFonts w:ascii="Verdana" w:hAnsi="Verdana" w:cs="Arial"/>
-                <w:u w:val="single"/>
-              </w:rPr>
-              <w:tab/>
-            </w:r>
-            <w:r>
-              <w:rPr>
-                <w:rFonts w:ascii="Verdana" w:hAnsi="Verdana" w:cs="Arial"/>
-                <w:u w:val="single"/>
-              </w:rPr>
-              <w:tab/>
-            </w:r>
-            <w:r>
-              <w:rPr>
-                <w:rFonts w:ascii="Verdana" w:hAnsi="Verdana" w:cs="Arial"/>
-                <w:u w:val="single"/>
-              </w:rPr>
-              <w:tab/>
-            </w:r>
-          </w:p>
-        </w:tc>
-      </w:tr>
-      <w:tr>
-        <w:trPr>
-          <w:trHeight w:val="153"/>
-        </w:trPr>
-        <w:tc>
-          <w:tcPr>
-            <w:tcW w:w="3020" w:type="dxa"/>
-          </w:tcPr>
-          <w:p>
-            <w:pPr>
-              <w:keepNext/>
-              <w:keepLines/>
-              <w:spacing w:after="160" w:line="278" w:lineRule="auto"/>
-              <w:rPr>
-                <w:rFonts w:ascii="Verdana" w:hAnsi="Verdana" w:cs="Arial"/>
-              </w:rPr>
-            </w:pPr>
-          </w:p>
-        </w:tc>
-        <w:tc>
-          <w:tcPr>
-            <w:tcW w:w="6340" w:type="dxa"/>
-            <w:hideMark/>
-          </w:tcPr>
-          <w:p>
-            <w:pPr>
-              <w:keepNext/>
-              <w:keepLines/>
-              <w:spacing w:after="160" w:line="278" w:lineRule="auto"/>
-              <w:rPr>
-                <w:rFonts w:ascii="Verdana" w:hAnsi="Verdana" w:cs="Arial"/>
-              </w:rPr>
-            </w:pPr>
-            <w:r>
-              <w:rPr>
-                <w:rFonts w:ascii="Verdana" w:hAnsi="Verdana" w:cs="Arial"/>
-              </w:rPr>
-              <w:t>Date</w:t>
-            </w:r>
-          </w:p>
-        </w:tc>
-      </w:tr>
-    </w:tbl>
-    <w:p>
-      <w:pPr>
         <w:keepNext/>
         <w:keepLines/>
-        <w:rPr>
-          <w:rFonts w:ascii="Verdana" w:hAnsi="Verdana" w:cs="Arial"/>
-          <w:b/>
-          <w:bCs/>
-        </w:rPr>
-      </w:pPr>
+        <w:spacing w:line="360" w:lineRule="auto"/>
+        <w:rPr>
+          <w:rFonts w:ascii="Verdana" w:hAnsi="Verdana" w:cs="Arial"/>
+        </w:rPr>
+      </w:pPr>
+      <w:r>
+        <w:rPr>
+          <w:rFonts w:ascii="Verdana" w:hAnsi="Verdana" w:cs="Arial"/>
+        </w:rPr>
+        <w:t xml:space="preserve">Subscribed and </w:t>
+      </w:r>
+      <w:proofErr w:type="gramStart"/>
+      <w:r>
+        <w:rPr>
+          <w:rFonts w:ascii="Verdana" w:hAnsi="Verdana" w:cs="Arial"/>
+        </w:rPr>
+        <w:t>sworn</w:t>
+      </w:r>
+      <w:proofErr w:type="gramEnd"/>
+      <w:r>
+        <w:rPr>
+          <w:rFonts w:ascii="Verdana" w:hAnsi="Verdana" w:cs="Arial"/>
+        </w:rPr>
+        <w:t xml:space="preserve"> </w:t>
+      </w:r>
+      <w:proofErr w:type="gramStart"/>
+      <w:r>
+        <w:rPr>
+          <w:rFonts w:ascii="Verdana" w:hAnsi="Verdana" w:cs="Arial"/>
+        </w:rPr>
+        <w:t>to before</w:t>
+      </w:r>
+      <w:proofErr w:type="gramEnd"/>
+      <w:r>
+        <w:rPr>
+          <w:rFonts w:ascii="Verdana" w:hAnsi="Verdana" w:cs="Arial"/>
+        </w:rPr>
+        <w:t xml:space="preserve"> me this </w:t>
+      </w:r>
+      <w:r>
+        <w:rPr>
+          <w:rFonts w:ascii="Verdana" w:hAnsi="Verdana" w:cs="Arial"/>
+          <w:u w:val="single"/>
+        </w:rPr>
+        <w:t>__________________</w:t>
+      </w:r>
+      <w:r>
+        <w:rPr>
+          <w:rFonts w:ascii="Verdana" w:hAnsi="Verdana" w:cs="Arial"/>
+        </w:rPr>
+        <w:t xml:space="preserve"> day of </w:t>
+      </w:r>
+      <w:r>
+        <w:rPr>
+          <w:rFonts w:ascii="Verdana" w:hAnsi="Verdana" w:cs="Arial"/>
+          <w:u w:val="single"/>
+        </w:rPr>
+        <w:t>____________________</w:t>
+      </w:r>
+      <w:r>
+        <w:rPr>
+          <w:rFonts w:ascii="Verdana" w:hAnsi="Verdana" w:cs="Arial"/>
+        </w:rPr>
+        <w:t>,</w:t>
+      </w:r>
+      <w:r>
+        <w:rPr>
+          <w:rFonts w:ascii="Verdana" w:hAnsi="Verdana" w:cs="Arial"/>
+        </w:rPr>
+        <w:t xml:space="preserve"> </w:t>
+      </w:r>
+      <w:r>
+        <w:rPr>
+          <w:rFonts w:ascii="Verdana" w:hAnsi="Verdana" w:cs="Arial"/>
+          <w:u w:val="single"/>
+        </w:rPr>
+        <w:t>________.</w:t>
+      </w:r>
     </w:p>
     <w:tbl>
       <w:tblPr>

</xml_diff>